<commit_message>
Update Tutorial — Clonar banco PostgreSQL local (produção → testes).docx
</commit_message>
<xml_diff>
--- a/Ajuda/Tutorial — Clonar banco PostgreSQL local (produção → testes).docx
+++ b/Ajuda/Tutorial — Clonar banco PostgreSQL local (produção → testes).docx
@@ -1,6 +1,6 @@
 
 <file path=word/document.xml><?xml version="1.0" encoding="utf-8"?>
-<w:document xmlns:wpc="http://schemas.microsoft.com/office/word/2010/wordprocessingCanvas" xmlns:cx="http://schemas.microsoft.com/office/drawing/2014/chartex" xmlns:cx1="http://schemas.microsoft.com/office/drawing/2015/9/8/chartex" xmlns:cx2="http://schemas.microsoft.com/office/drawing/2015/10/21/chartex" xmlns:cx3="http://schemas.microsoft.com/office/drawing/2016/5/9/chartex" xmlns:cx4="http://schemas.microsoft.com/office/drawing/2016/5/10/chartex" xmlns:cx5="http://schemas.microsoft.com/office/drawing/2016/5/11/chartex" xmlns:cx6="http://schemas.microsoft.com/office/drawing/2016/5/12/chartex" xmlns:cx7="http://schemas.microsoft.com/office/drawing/2016/5/13/chartex" xmlns:cx8="http://schemas.microsoft.com/office/drawing/2016/5/14/chartex" xmlns:mc="http://schemas.openxmlformats.org/markup-compatibility/2006" xmlns:aink="http://schemas.microsoft.com/office/drawing/2016/ink" xmlns:am3d="http://schemas.microsoft.com/office/drawing/2017/model3d" xmlns:o="urn:schemas-microsoft-com:office:office" xmlns:oel="http://schemas.microsoft.com/office/2019/extlst" xmlns:r="http://schemas.openxmlformats.org/officeDocument/2006/relationships" xmlns:m="http://schemas.openxmlformats.org/officeDocument/2006/math" xmlns:v="urn:schemas-microsoft-com:vml" xmlns:wp14="http://schemas.microsoft.com/office/word/2010/wordprocessingDrawing" xmlns:wp="http://schemas.openxmlformats.org/drawingml/2006/wordprocessingDrawing" xmlns:w10="urn:schemas-microsoft-com:office:word" xmlns:w="http://schemas.openxmlformats.org/wordprocessingml/2006/main" xmlns:w14="http://schemas.microsoft.com/office/word/2010/wordml" xmlns:w15="http://schemas.microsoft.com/office/word/2012/wordml" xmlns:w16cex="http://schemas.microsoft.com/office/word/2018/wordml/cex" xmlns:w16cid="http://schemas.microsoft.com/office/word/2016/wordml/cid" xmlns:w16="http://schemas.microsoft.com/office/word/2018/wordml" xmlns:w16du="http://schemas.microsoft.com/office/word/2023/wordml/word16du" xmlns:w16sdtdh="http://schemas.microsoft.com/office/word/2020/wordml/sdtdatahash" xmlns:w16sdtfl="http://schemas.microsoft.com/office/word/2024/wordml/sdtformatlock" xmlns:w16se="http://schemas.microsoft.com/office/word/2015/wordml/symex" xmlns:wpg="http://schemas.microsoft.com/office/word/2010/wordprocessingGroup" xmlns:wpi="http://schemas.microsoft.com/office/word/2010/wordprocessingInk" xmlns:wne="http://schemas.microsoft.com/office/word/2006/wordml" xmlns:wps="http://schemas.microsoft.com/office/word/2010/wordprocessingShape" mc:Ignorable="w14 w15 w16se w16cid w16 w16cex w16sdtdh w16sdtfl w16du wp14">
+<w:document xmlns:wpc="http://schemas.microsoft.com/office/word/2010/wordprocessingCanvas" xmlns:cx="http://schemas.microsoft.com/office/drawing/2014/chartex" xmlns:cx1="http://schemas.microsoft.com/office/drawing/2015/9/8/chartex" xmlns:cx2="http://schemas.microsoft.com/office/drawing/2015/10/21/chartex" xmlns:cx3="http://schemas.microsoft.com/office/drawing/2016/5/9/chartex" xmlns:cx4="http://schemas.microsoft.com/office/drawing/2016/5/10/chartex" xmlns:cx5="http://schemas.microsoft.com/office/drawing/2016/5/11/chartex" xmlns:cx6="http://schemas.microsoft.com/office/drawing/2016/5/12/chartex" xmlns:cx7="http://schemas.microsoft.com/office/drawing/2016/5/13/chartex" xmlns:cx8="http://schemas.microsoft.com/office/drawing/2016/5/14/chartex" xmlns:mc="http://schemas.openxmlformats.org/markup-compatibility/2006" xmlns:aink="http://schemas.microsoft.com/office/drawing/2016/ink" xmlns:am3d="http://schemas.microsoft.com/office/drawing/2017/model3d" xmlns:o="urn:schemas-microsoft-com:office:office" xmlns:oel="http://schemas.microsoft.com/office/2019/extlst" xmlns:r="http://schemas.openxmlformats.org/officeDocument/2006/relationships" xmlns:m="http://schemas.openxmlformats.org/officeDocument/2006/math" xmlns:v="urn:schemas-microsoft-com:vml" xmlns:wp14="http://schemas.microsoft.com/office/word/2010/wordprocessingDrawing" xmlns:wp="http://schemas.openxmlformats.org/drawingml/2006/wordprocessingDrawing" xmlns:w10="urn:schemas-microsoft-com:office:word" xmlns:w="http://schemas.openxmlformats.org/wordprocessingml/2006/main" xmlns:w14="http://schemas.microsoft.com/office/word/2010/wordml" xmlns:w15="http://schemas.microsoft.com/office/word/2012/wordml" xmlns:w16cex="http://schemas.microsoft.com/office/word/2018/wordml/cex" xmlns:w16cid="http://schemas.microsoft.com/office/word/2016/wordml/cid" xmlns:w16="http://schemas.microsoft.com/office/word/2018/wordml" xmlns:w16sdtdh="http://schemas.microsoft.com/office/word/2020/wordml/sdtdatahash" xmlns:w16se="http://schemas.microsoft.com/office/word/2015/wordml/symex" xmlns:wpg="http://schemas.microsoft.com/office/word/2010/wordprocessingGroup" xmlns:wpi="http://schemas.microsoft.com/office/word/2010/wordprocessingInk" xmlns:wne="http://schemas.microsoft.com/office/word/2006/wordml" xmlns:wps="http://schemas.microsoft.com/office/word/2010/wordprocessingShape" mc:Ignorable="w14 w15 w16se w16cid w16 w16cex w16sdtdh wp14">
   <w:body>
     <w:p>
       <w:pPr>
@@ -1262,49 +1262,55 @@
       </w:r>
     </w:p>
     <w:p>
-      <w:r>
-        <w:t xml:space="preserve">DROP SCHEMA </w:t>
-      </w:r>
-      <w:proofErr w:type="spellStart"/>
-      <w:r>
-        <w:t>public</w:t>
-      </w:r>
-      <w:proofErr w:type="spellEnd"/>
-      <w:r>
-        <w:t xml:space="preserve"> CASCADE;</w:t>
-      </w:r>
-    </w:p>
-    <w:p>
-      <w:r>
-        <w:t xml:space="preserve">CREATE SCHEMA </w:t>
-      </w:r>
-      <w:proofErr w:type="spellStart"/>
-      <w:r>
-        <w:t>public</w:t>
-      </w:r>
-      <w:proofErr w:type="spellEnd"/>
-      <w:r>
-        <w:t>;</w:t>
-      </w:r>
-    </w:p>
-    <w:p>
-      <w:r>
-        <w:t xml:space="preserve">GRANT ALL ON SCHEMA </w:t>
-      </w:r>
-      <w:proofErr w:type="spellStart"/>
-      <w:r>
-        <w:t>public</w:t>
-      </w:r>
-      <w:proofErr w:type="spellEnd"/>
-      <w:r>
-        <w:t xml:space="preserve"> TO </w:t>
-      </w:r>
-      <w:proofErr w:type="spellStart"/>
-      <w:r>
+      <w:pPr>
+        <w:rPr>
+          <w:lang w:val="en-US"/>
+        </w:rPr>
+      </w:pPr>
+      <w:r>
+        <w:rPr>
+          <w:lang w:val="en-US"/>
+        </w:rPr>
+        <w:t>DROP SCHEMA public CASCADE;</w:t>
+      </w:r>
+    </w:p>
+    <w:p>
+      <w:pPr>
+        <w:rPr>
+          <w:lang w:val="en-US"/>
+        </w:rPr>
+      </w:pPr>
+      <w:r>
+        <w:rPr>
+          <w:lang w:val="en-US"/>
+        </w:rPr>
+        <w:t>CREATE SCHEMA public;</w:t>
+      </w:r>
+    </w:p>
+    <w:p>
+      <w:pPr>
+        <w:rPr>
+          <w:lang w:val="en-US"/>
+        </w:rPr>
+      </w:pPr>
+      <w:r>
+        <w:rPr>
+          <w:lang w:val="en-US"/>
+        </w:rPr>
+        <w:t xml:space="preserve">GRANT ALL ON SCHEMA public TO </w:t>
+      </w:r>
+      <w:proofErr w:type="spellStart"/>
+      <w:r>
+        <w:rPr>
+          <w:lang w:val="en-US"/>
+        </w:rPr>
         <w:t>postgres</w:t>
       </w:r>
       <w:proofErr w:type="spellEnd"/>
       <w:r>
+        <w:rPr>
+          <w:lang w:val="en-US"/>
+        </w:rPr>
         <w:t>;</w:t>
       </w:r>
     </w:p>
@@ -1585,74 +1591,137 @@
       </w:r>
     </w:p>
     <w:p>
-      <w:proofErr w:type="spellStart"/>
-      <w:r>
+      <w:pPr>
+        <w:rPr>
+          <w:lang w:val="en-US"/>
+        </w:rPr>
+      </w:pPr>
+      <w:proofErr w:type="spellStart"/>
+      <w:r>
+        <w:rPr>
+          <w:lang w:val="en-US"/>
+        </w:rPr>
         <w:t>dropdb</w:t>
       </w:r>
       <w:proofErr w:type="spellEnd"/>
       <w:r>
+        <w:rPr>
+          <w:lang w:val="en-US"/>
+        </w:rPr>
         <w:t xml:space="preserve"> -U </w:t>
       </w:r>
       <w:proofErr w:type="spellStart"/>
       <w:r>
+        <w:rPr>
+          <w:lang w:val="en-US"/>
+        </w:rPr>
         <w:t>postgres</w:t>
       </w:r>
       <w:proofErr w:type="spellEnd"/>
       <w:r>
+        <w:rPr>
+          <w:lang w:val="en-US"/>
+        </w:rPr>
         <w:t xml:space="preserve"> </w:t>
       </w:r>
       <w:proofErr w:type="spellStart"/>
       <w:r>
+        <w:rPr>
+          <w:lang w:val="en-US"/>
+        </w:rPr>
         <w:t>postgres_test</w:t>
       </w:r>
       <w:proofErr w:type="spellEnd"/>
     </w:p>
     <w:p>
-      <w:proofErr w:type="spellStart"/>
-      <w:r>
+      <w:pPr>
+        <w:rPr>
+          <w:lang w:val="en-US"/>
+        </w:rPr>
+      </w:pPr>
+      <w:proofErr w:type="spellStart"/>
+      <w:r>
+        <w:rPr>
+          <w:lang w:val="en-US"/>
+        </w:rPr>
         <w:t>createdb</w:t>
       </w:r>
       <w:proofErr w:type="spellEnd"/>
       <w:r>
+        <w:rPr>
+          <w:lang w:val="en-US"/>
+        </w:rPr>
         <w:t xml:space="preserve"> -U </w:t>
       </w:r>
       <w:proofErr w:type="spellStart"/>
       <w:r>
+        <w:rPr>
+          <w:lang w:val="en-US"/>
+        </w:rPr>
         <w:t>postgres</w:t>
       </w:r>
       <w:proofErr w:type="spellEnd"/>
       <w:r>
+        <w:rPr>
+          <w:lang w:val="en-US"/>
+        </w:rPr>
         <w:t xml:space="preserve"> </w:t>
       </w:r>
       <w:proofErr w:type="spellStart"/>
       <w:r>
+        <w:rPr>
+          <w:lang w:val="en-US"/>
+        </w:rPr>
         <w:t>postgres_test</w:t>
       </w:r>
       <w:proofErr w:type="spellEnd"/>
     </w:p>
     <w:p>
-      <w:proofErr w:type="spellStart"/>
-      <w:r>
+      <w:pPr>
+        <w:rPr>
+          <w:lang w:val="en-US"/>
+        </w:rPr>
+      </w:pPr>
+      <w:proofErr w:type="spellStart"/>
+      <w:r>
+        <w:rPr>
+          <w:lang w:val="en-US"/>
+        </w:rPr>
         <w:t>psql</w:t>
       </w:r>
       <w:proofErr w:type="spellEnd"/>
       <w:r>
+        <w:rPr>
+          <w:lang w:val="en-US"/>
+        </w:rPr>
         <w:t xml:space="preserve"> -U </w:t>
       </w:r>
       <w:proofErr w:type="spellStart"/>
       <w:r>
+        <w:rPr>
+          <w:lang w:val="en-US"/>
+        </w:rPr>
         <w:t>postgres</w:t>
       </w:r>
       <w:proofErr w:type="spellEnd"/>
       <w:r>
+        <w:rPr>
+          <w:lang w:val="en-US"/>
+        </w:rPr>
         <w:t xml:space="preserve"> -d </w:t>
       </w:r>
       <w:proofErr w:type="spellStart"/>
       <w:r>
+        <w:rPr>
+          <w:lang w:val="en-US"/>
+        </w:rPr>
         <w:t>postgres_test</w:t>
       </w:r>
       <w:proofErr w:type="spellEnd"/>
       <w:r>
+        <w:rPr>
+          <w:lang w:val="en-US"/>
+        </w:rPr>
         <w:t xml:space="preserve"> &lt; C:\Users\Andre\Desktop\postgres_dump.sql</w:t>
       </w:r>
     </w:p>
@@ -1928,6 +1997,135 @@
       </w:r>
     </w:p>
     <w:p/>
+    <w:p/>
+    <w:p/>
+    <w:p/>
+    <w:p/>
+    <w:p/>
+    <w:p>
+      <w:pPr>
+        <w:rPr>
+          <w:lang w:val="en-US"/>
+        </w:rPr>
+      </w:pPr>
+      <w:r>
+        <w:rPr>
+          <w:lang w:val="en-US"/>
+        </w:rPr>
+        <w:t xml:space="preserve">SELECT 'DROP TABLE public.' || </w:t>
+      </w:r>
+      <w:proofErr w:type="spellStart"/>
+      <w:r>
+        <w:rPr>
+          <w:lang w:val="en-US"/>
+        </w:rPr>
+        <w:t>quote_ident</w:t>
+      </w:r>
+      <w:proofErr w:type="spellEnd"/>
+      <w:r>
+        <w:rPr>
+          <w:lang w:val="en-US"/>
+        </w:rPr>
+        <w:t>(</w:t>
+      </w:r>
+      <w:proofErr w:type="spellStart"/>
+      <w:r>
+        <w:rPr>
+          <w:lang w:val="en-US"/>
+        </w:rPr>
+        <w:t>table_name</w:t>
+      </w:r>
+      <w:proofErr w:type="spellEnd"/>
+      <w:r>
+        <w:rPr>
+          <w:lang w:val="en-US"/>
+        </w:rPr>
+        <w:t>) || ' CASCADE;'</w:t>
+      </w:r>
+    </w:p>
+    <w:p>
+      <w:pPr>
+        <w:rPr>
+          <w:lang w:val="en-US"/>
+        </w:rPr>
+      </w:pPr>
+      <w:r>
+        <w:rPr>
+          <w:lang w:val="en-US"/>
+        </w:rPr>
+        <w:t xml:space="preserve">FROM </w:t>
+      </w:r>
+      <w:proofErr w:type="spellStart"/>
+      <w:r>
+        <w:rPr>
+          <w:lang w:val="en-US"/>
+        </w:rPr>
+        <w:t>information_</w:t>
+      </w:r>
+      <w:proofErr w:type="gramStart"/>
+      <w:r>
+        <w:rPr>
+          <w:lang w:val="en-US"/>
+        </w:rPr>
+        <w:t>schema.tables</w:t>
+      </w:r>
+      <w:proofErr w:type="spellEnd"/>
+      <w:proofErr w:type="gramEnd"/>
+    </w:p>
+    <w:p>
+      <w:pPr>
+        <w:rPr>
+          <w:lang w:val="en-US"/>
+        </w:rPr>
+      </w:pPr>
+      <w:r>
+        <w:rPr>
+          <w:lang w:val="en-US"/>
+        </w:rPr>
+        <w:t xml:space="preserve">WHERE </w:t>
+      </w:r>
+      <w:proofErr w:type="spellStart"/>
+      <w:r>
+        <w:rPr>
+          <w:lang w:val="en-US"/>
+        </w:rPr>
+        <w:t>table_schema</w:t>
+      </w:r>
+      <w:proofErr w:type="spellEnd"/>
+      <w:r>
+        <w:rPr>
+          <w:lang w:val="en-US"/>
+        </w:rPr>
+        <w:t xml:space="preserve"> = 'public'</w:t>
+      </w:r>
+    </w:p>
+    <w:p>
+      <w:pPr>
+        <w:rPr>
+          <w:lang w:val="en-US"/>
+        </w:rPr>
+      </w:pPr>
+      <w:r>
+        <w:rPr>
+          <w:lang w:val="en-US"/>
+        </w:rPr>
+        <w:t xml:space="preserve">  AND </w:t>
+      </w:r>
+      <w:proofErr w:type="spellStart"/>
+      <w:r>
+        <w:rPr>
+          <w:lang w:val="en-US"/>
+        </w:rPr>
+        <w:t>table_type</w:t>
+      </w:r>
+      <w:proofErr w:type="spellEnd"/>
+      <w:r>
+        <w:rPr>
+          <w:lang w:val="en-US"/>
+        </w:rPr>
+        <w:t xml:space="preserve"> = 'BASE TABLE';</w:t>
+      </w:r>
+    </w:p>
     <w:sectPr>
       <w:pgSz w:w="11906" w:h="16838"/>
       <w:pgMar w:top="1417" w:right="1701" w:bottom="1417" w:left="1701" w:header="708" w:footer="708" w:gutter="0"/>
@@ -1939,7 +2137,7 @@
 </file>
 
 <file path=word/numbering.xml><?xml version="1.0" encoding="utf-8"?>
-<w:numbering xmlns:wpc="http://schemas.microsoft.com/office/word/2010/wordprocessingCanvas" xmlns:cx="http://schemas.microsoft.com/office/drawing/2014/chartex" xmlns:cx1="http://schemas.microsoft.com/office/drawing/2015/9/8/chartex" xmlns:cx2="http://schemas.microsoft.com/office/drawing/2015/10/21/chartex" xmlns:cx3="http://schemas.microsoft.com/office/drawing/2016/5/9/chartex" xmlns:cx4="http://schemas.microsoft.com/office/drawing/2016/5/10/chartex" xmlns:cx5="http://schemas.microsoft.com/office/drawing/2016/5/11/chartex" xmlns:cx6="http://schemas.microsoft.com/office/drawing/2016/5/12/chartex" xmlns:cx7="http://schemas.microsoft.com/office/drawing/2016/5/13/chartex" xmlns:cx8="http://schemas.microsoft.com/office/drawing/2016/5/14/chartex" xmlns:mc="http://schemas.openxmlformats.org/markup-compatibility/2006" xmlns:aink="http://schemas.microsoft.com/office/drawing/2016/ink" xmlns:am3d="http://schemas.microsoft.com/office/drawing/2017/model3d" xmlns:o="urn:schemas-microsoft-com:office:office" xmlns:oel="http://schemas.microsoft.com/office/2019/extlst" xmlns:r="http://schemas.openxmlformats.org/officeDocument/2006/relationships" xmlns:m="http://schemas.openxmlformats.org/officeDocument/2006/math" xmlns:v="urn:schemas-microsoft-com:vml" xmlns:wp14="http://schemas.microsoft.com/office/word/2010/wordprocessingDrawing" xmlns:wp="http://schemas.openxmlformats.org/drawingml/2006/wordprocessingDrawing" xmlns:w10="urn:schemas-microsoft-com:office:word" xmlns:w="http://schemas.openxmlformats.org/wordprocessingml/2006/main" xmlns:w14="http://schemas.microsoft.com/office/word/2010/wordml" xmlns:w15="http://schemas.microsoft.com/office/word/2012/wordml" xmlns:w16cex="http://schemas.microsoft.com/office/word/2018/wordml/cex" xmlns:w16cid="http://schemas.microsoft.com/office/word/2016/wordml/cid" xmlns:w16="http://schemas.microsoft.com/office/word/2018/wordml" xmlns:w16du="http://schemas.microsoft.com/office/word/2023/wordml/word16du" xmlns:w16sdtdh="http://schemas.microsoft.com/office/word/2020/wordml/sdtdatahash" xmlns:w16sdtfl="http://schemas.microsoft.com/office/word/2024/wordml/sdtformatlock" xmlns:w16se="http://schemas.microsoft.com/office/word/2015/wordml/symex" xmlns:wpg="http://schemas.microsoft.com/office/word/2010/wordprocessingGroup" xmlns:wpi="http://schemas.microsoft.com/office/word/2010/wordprocessingInk" xmlns:wne="http://schemas.microsoft.com/office/word/2006/wordml" xmlns:wps="http://schemas.microsoft.com/office/word/2010/wordprocessingShape" mc:Ignorable="w14 w15 w16se w16cid w16 w16cex w16sdtdh w16sdtfl w16du wp14">
+<w:numbering xmlns:wpc="http://schemas.microsoft.com/office/word/2010/wordprocessingCanvas" xmlns:cx="http://schemas.microsoft.com/office/drawing/2014/chartex" xmlns:cx1="http://schemas.microsoft.com/office/drawing/2015/9/8/chartex" xmlns:cx2="http://schemas.microsoft.com/office/drawing/2015/10/21/chartex" xmlns:cx3="http://schemas.microsoft.com/office/drawing/2016/5/9/chartex" xmlns:cx4="http://schemas.microsoft.com/office/drawing/2016/5/10/chartex" xmlns:cx5="http://schemas.microsoft.com/office/drawing/2016/5/11/chartex" xmlns:cx6="http://schemas.microsoft.com/office/drawing/2016/5/12/chartex" xmlns:cx7="http://schemas.microsoft.com/office/drawing/2016/5/13/chartex" xmlns:cx8="http://schemas.microsoft.com/office/drawing/2016/5/14/chartex" xmlns:mc="http://schemas.openxmlformats.org/markup-compatibility/2006" xmlns:aink="http://schemas.microsoft.com/office/drawing/2016/ink" xmlns:am3d="http://schemas.microsoft.com/office/drawing/2017/model3d" xmlns:o="urn:schemas-microsoft-com:office:office" xmlns:oel="http://schemas.microsoft.com/office/2019/extlst" xmlns:r="http://schemas.openxmlformats.org/officeDocument/2006/relationships" xmlns:m="http://schemas.openxmlformats.org/officeDocument/2006/math" xmlns:v="urn:schemas-microsoft-com:vml" xmlns:wp14="http://schemas.microsoft.com/office/word/2010/wordprocessingDrawing" xmlns:wp="http://schemas.openxmlformats.org/drawingml/2006/wordprocessingDrawing" xmlns:w10="urn:schemas-microsoft-com:office:word" xmlns:w="http://schemas.openxmlformats.org/wordprocessingml/2006/main" xmlns:w14="http://schemas.microsoft.com/office/word/2010/wordml" xmlns:w15="http://schemas.microsoft.com/office/word/2012/wordml" xmlns:w16cex="http://schemas.microsoft.com/office/word/2018/wordml/cex" xmlns:w16cid="http://schemas.microsoft.com/office/word/2016/wordml/cid" xmlns:w16="http://schemas.microsoft.com/office/word/2018/wordml" xmlns:w16sdtdh="http://schemas.microsoft.com/office/word/2020/wordml/sdtdatahash" xmlns:w16se="http://schemas.microsoft.com/office/word/2015/wordml/symex" xmlns:wpg="http://schemas.microsoft.com/office/word/2010/wordprocessingGroup" xmlns:wpi="http://schemas.microsoft.com/office/word/2010/wordprocessingInk" xmlns:wne="http://schemas.microsoft.com/office/word/2006/wordml" xmlns:wps="http://schemas.microsoft.com/office/word/2010/wordprocessingShape" mc:Ignorable="w14 w15 w16se w16cid w16 w16cex w16sdtdh wp14">
   <w:abstractNum w:abstractNumId="0" w15:restartNumberingAfterBreak="0">
     <w:nsid w:val="04DD482C"/>
     <w:multiLevelType w:val="multilevel"/>
@@ -2820,7 +3018,7 @@
 </file>
 
 <file path=word/styles.xml><?xml version="1.0" encoding="utf-8"?>
-<w:styles xmlns:mc="http://schemas.openxmlformats.org/markup-compatibility/2006" xmlns:r="http://schemas.openxmlformats.org/officeDocument/2006/relationships" xmlns:w="http://schemas.openxmlformats.org/wordprocessingml/2006/main" xmlns:w14="http://schemas.microsoft.com/office/word/2010/wordml" xmlns:w15="http://schemas.microsoft.com/office/word/2012/wordml" xmlns:w16cex="http://schemas.microsoft.com/office/word/2018/wordml/cex" xmlns:w16cid="http://schemas.microsoft.com/office/word/2016/wordml/cid" xmlns:w16="http://schemas.microsoft.com/office/word/2018/wordml" xmlns:w16du="http://schemas.microsoft.com/office/word/2023/wordml/word16du" xmlns:w16sdtdh="http://schemas.microsoft.com/office/word/2020/wordml/sdtdatahash" xmlns:w16sdtfl="http://schemas.microsoft.com/office/word/2024/wordml/sdtformatlock" xmlns:w16se="http://schemas.microsoft.com/office/word/2015/wordml/symex" mc:Ignorable="w14 w15 w16se w16cid w16 w16cex w16sdtdh w16sdtfl w16du">
+<w:styles xmlns:mc="http://schemas.openxmlformats.org/markup-compatibility/2006" xmlns:r="http://schemas.openxmlformats.org/officeDocument/2006/relationships" xmlns:w="http://schemas.openxmlformats.org/wordprocessingml/2006/main" xmlns:w14="http://schemas.microsoft.com/office/word/2010/wordml" xmlns:w15="http://schemas.microsoft.com/office/word/2012/wordml" xmlns:w16cex="http://schemas.microsoft.com/office/word/2018/wordml/cex" xmlns:w16cid="http://schemas.microsoft.com/office/word/2016/wordml/cid" xmlns:w16="http://schemas.microsoft.com/office/word/2018/wordml" xmlns:w16sdtdh="http://schemas.microsoft.com/office/word/2020/wordml/sdtdatahash" xmlns:w16se="http://schemas.microsoft.com/office/word/2015/wordml/symex" mc:Ignorable="w14 w15 w16se w16cid w16 w16cex w16sdtdh">
   <w:docDefaults>
     <w:rPrDefault>
       <w:rPr>
@@ -3423,6 +3621,7 @@
   <w:style w:type="character" w:default="1" w:styleId="Fontepargpadro">
     <w:name w:val="Default Paragraph Font"/>
     <w:uiPriority w:val="1"/>
+    <w:semiHidden/>
     <w:unhideWhenUsed/>
   </w:style>
   <w:style w:type="table" w:default="1" w:styleId="Tabelanormal">

</xml_diff>